<commit_message>
Add section3 Q9 assets; update docs & analyses
Add Section 3 Q9 2022 presentation and many visualization assets (PNG/PPTX) under docs and python analysis results. Expand and clarify client-facing documentation for GivingTuesday, IRS EO BMF, NCCS Core/Postcard/BMF sources (improved background, collection, limitations, storage, and cleaning guidance). Update revenue_sources_black_hills analysis (code, README, reports, notebook, figures, and requirements), add new diagnostics and validation scripts, add sample size diagnostics report, and adjust tests. Also remove an obsolete ANOVA answer file. These changes package new Q9 deliverables, strengthen documentation on data provenance and limitations, and surface updated analysis outputs and tooling.
</commit_message>
<xml_diff>
--- a/docs/final_preprocessing_docs/general_docs/word/givingtuesday_990_datamart_client_documentation.docx
+++ b/docs/final_preprocessing_docs/general_docs/word/givingtuesday_990_datamart_client_documentation.docx
@@ -23,17 +23,23 @@
         <w:spacing w:before="0" w:after="80"/>
       </w:pPr>
       <w:r>
-        <w:t xml:space="preserve">The GivingTuesday 990 DataMart pipeline uses the public GivingTuesday DataMart catalog and selected raw DataMart CSV files to build benchmark-filtered filing outputs and a basic-only analysis dataset for </w:t>
+        <w:t>The GivingTuesday 990 DataMart is a public dataset built from IRS Form 990-family filings for U.S.-based nonprofits. GivingTuesday describes the DataMart as an openly accessible source of nonprofit Form 990 filing data. In this project, it is the main source used for detailed filing-level financial information across Forms 990, 990-EZ, and 990-PF.</w:t>
       </w:r>
+    </w:p>
+    <w:p>
+      <w:pPr>
+        <w:spacing w:before="0" w:after="80"/>
+      </w:pPr>
       <w:r>
-        <w:rPr>
-          <w:rFonts w:ascii="Consolas" w:hAnsi="Consolas"/>
-          <w:sz w:val="20"/>
-        </w:rPr>
-        <w:t>2022-2024</w:t>
+        <w:t>The files used here include a Combined Forms DataMart and separate Basic Fields files for Forms 990, 990-EZ, and 990-PF. Together, these files provide organization identity, filing year, filing form, revenue, expenses, assets, contribution-related fields, and selected fields needed for analysis. The project converts those large raw files into smaller analysis-ready datasets for the project counties and regions.</w:t>
       </w:r>
+    </w:p>
+    <w:p>
+      <w:pPr>
+        <w:spacing w:before="0" w:after="80"/>
+      </w:pPr>
       <w:r>
-        <w:t>.</w:t>
+        <w:t>This dataset is useful because it contains more detailed financial information than registry-style sources such as BMF. It is also important to interpret carefully: different organizations file different versions of the Form 990 family, and the IRS forms do not always separate donor types in the way analysts may want.</w:t>
       </w:r>
     </w:p>
     <w:p>
@@ -48,7 +54,7 @@
           <w:rFonts w:ascii="Consolas" w:hAnsi="Consolas"/>
           <w:sz w:val="20"/>
         </w:rPr>
-        <w:t>documentation/final_preprocessing_docs/technical_docs/pipeline_docs/givingtuesday_datamart_pipeline.md</w:t>
+        <w:t>docs/final_preprocessing_docs/technical_docs/pipeline_docs/givingtuesday_datamart_pipeline.md</w:t>
       </w:r>
       <w:r>
         <w:t>.</w:t>
@@ -111,7 +117,7 @@
         <w:pStyle w:val="ListBullet"/>
       </w:pPr>
       <w:r>
-        <w:t>Per-file download URLs are catalog-derived and captured in pipeline manifests.</w:t>
+        <w:t>Per-file download URLs are selected from the GivingTuesday catalog and recorded in the pipeline manifests.</w:t>
       </w:r>
     </w:p>
     <w:p>
@@ -119,7 +125,7 @@
         <w:pStyle w:val="ListBullet"/>
       </w:pPr>
       <w:r>
-        <w:t>Raw dictionary support comes from the exported catalog and field dictionary files.</w:t>
+        <w:t>Raw dictionary support comes from the exported GivingTuesday catalog and field dictionary files.</w:t>
       </w:r>
     </w:p>
     <w:p>
@@ -135,7 +141,7 @@
         <w:spacing w:before="0" w:after="80"/>
       </w:pPr>
       <w:r>
-        <w:t>The pipeline consumes GivingTuesday DataMart files derived from public nonprofit filing data and GivingTuesday's cataloged standard-field extracts. This repo does not collect voluntary survey responses and does not build the GT analysis layer from IRS XML directly.</w:t>
+        <w:t>The DataMart files are derived from public IRS Form 990-family filings. These are tax filings submitted by nonprofit organizations that are required to file a Form 990, 990-EZ, or 990-PF. The project does not collect survey responses and does not create the GivingTuesday analysis layer directly from IRS XML files.</w:t>
       </w:r>
     </w:p>
     <w:p>
@@ -151,7 +157,7 @@
         <w:spacing w:before="0" w:after="80"/>
       </w:pPr>
       <w:r>
-        <w:t xml:space="preserve">The pipeline selects the Combined Forms DataMart plus Basic Fields files for Forms 990, 990-EZ, and 990-PF, restricts the current analysis window to tax years </w:t>
+        <w:t xml:space="preserve">The project uses selected GivingTuesday DataMart files for tax years </w:t>
       </w:r>
       <w:r>
         <w:rPr>
@@ -161,7 +167,55 @@
         <w:t>2022-2024</w:t>
       </w:r>
       <w:r>
-        <w:t>, and applies benchmark geography/ROI admission before heavy combine stages. The final analysis layer is GT basic-only and uses documented NCCS/IRS classification enrichment because the GT raw fields used here do not carry the required NTEE fields directly.</w:t>
+        <w:t>. Records are kept when they can be connected to the project counties and regions. The pipeline focuses on the Basic Fields files for Forms 990, 990-EZ, and 990-PF for the final row-level analysis dataset.</w:t>
+      </w:r>
+    </w:p>
+    <w:p>
+      <w:pPr>
+        <w:spacing w:before="0" w:after="80"/>
+      </w:pPr>
+      <w:r>
+        <w:t>Important limitations:</w:t>
+      </w:r>
+    </w:p>
+    <w:p>
+      <w:pPr>
+        <w:pStyle w:val="ListBullet"/>
+      </w:pPr>
+      <w:r>
+        <w:t>Not every nonprofit files a full Form 990. Some smaller organizations file Form 990-N/e-Postcard, some file Form 990-EZ, private foundations file Form 990-PF, and some exempt entities may not appear in these public filing files.</w:t>
+      </w:r>
+    </w:p>
+    <w:p>
+      <w:pPr>
+        <w:pStyle w:val="ListBullet"/>
+      </w:pPr>
+      <w:r>
+        <w:t>The final GivingTuesday analysis dataset is based on the selected Basic Fields files. It is not a complete copy of every GivingTuesday DataMart field.</w:t>
+      </w:r>
+    </w:p>
+    <w:p>
+      <w:pPr>
+        <w:pStyle w:val="ListBullet"/>
+      </w:pPr>
+      <w:r>
+        <w:t>Some contribution categories are limited by how the IRS forms are designed. For example, Form 990 includes one broad "other contributions" line that can mix individual gifts, foundation grants, donor-advised fund distributions, corporate gifts, and bequests. That line cannot be split into clean donor types from this DataMart alone.</w:t>
+      </w:r>
+    </w:p>
+    <w:p>
+      <w:pPr>
+        <w:pStyle w:val="ListBullet"/>
+      </w:pPr>
+      <w:r>
+        <w:t>Forms 990-EZ and 990-PF do not report all of the same contribution subcategories that full Form 990 filers report.</w:t>
+      </w:r>
+    </w:p>
+    <w:p>
+      <w:pPr>
+        <w:pStyle w:val="ListBullet"/>
+      </w:pPr>
+      <w:r>
+        <w:t>The selected GivingTuesday fields do not always include all classification fields needed for this project, so the analysis layer supplements missing classification information from NCCS BMF and IRS EO BMF registry sources.</w:t>
       </w:r>
     </w:p>
     <w:p>
@@ -177,7 +231,7 @@
         <w:spacing w:before="0" w:after="80"/>
       </w:pPr>
       <w:r>
-        <w:t xml:space="preserve">Required raw GT CSVs and metadata are downloaded locally, uploaded unchanged to Bronze S3 under </w:t>
+        <w:t xml:space="preserve">Required raw GivingTuesday CSV files and metadata are downloaded locally, uploaded unchanged to Bronze S3 under </w:t>
       </w:r>
       <w:r>
         <w:rPr>
@@ -197,7 +251,15 @@
         <w:t>bronze/givingtuesday_990/datamarts/metadata/</w:t>
       </w:r>
       <w:r>
-        <w:t xml:space="preserve">, and verified with source/local/S3 byte checks. Pre-Silver and Silver filing outputs are stored under GT Bronze/Silver filing prefixes, and analysis documentation is stored under </w:t>
+        <w:t>, and checked against expected file sizes. This gives the project a preserved copy of the downloaded source files.</w:t>
+      </w:r>
+    </w:p>
+    <w:p>
+      <w:pPr>
+        <w:spacing w:before="0" w:after="80"/>
+      </w:pPr>
+      <w:r>
+        <w:t xml:space="preserve">Intermediate project-ready outputs are stored under the GivingTuesday Bronze and Silver prefixes. Final analysis documentation and analysis outputs are stored under </w:t>
       </w:r>
       <w:r>
         <w:rPr>
@@ -223,7 +285,7 @@
         <w:spacing w:before="0" w:after="80"/>
       </w:pPr>
       <w:r>
-        <w:t>Raw GT CSV files remain unchanged in Bronze S3. Later stages create a normalized Combined cache Parquet, admitted pre-Silver Parquet files, Silver benchmark Parquet files, and final analysis Parquet outputs.</w:t>
+        <w:t>The raw GivingTuesday CSV files are preserved unchanged in Bronze S3. Later pipeline steps convert the data into Parquet files, which are easier and faster to read in Python. These converted files include a normalized Combined Forms cache, pre-Silver files, Silver project-region files, and final analysis outputs.</w:t>
       </w:r>
     </w:p>
     <w:p>
@@ -239,7 +301,113 @@
         <w:spacing w:before="0" w:after="80"/>
       </w:pPr>
       <w:r>
-        <w:t>Cleaning includes catalog-driven required-file selection, raw header-based field dictionary export, low-risk field normalization, ROI key construction, benchmark geography assignment, deterministic filing deduplication, Basic/Combined curation, calculated revenue/contribution/grant fields, NCCS/IRS classification enrichment, and imputed/proxy exclusion-support flags.</w:t>
+        <w:t>The cleaning process keeps the raw source files unchanged, then creates smaller project-specific files for analysis:</w:t>
+      </w:r>
+    </w:p>
+    <w:p>
+      <w:pPr>
+        <w:pStyle w:val="ListBullet"/>
+      </w:pPr>
+      <w:r>
+        <w:t>Selects the required GivingTuesday DataMart files from the public catalog and records which files were used.</w:t>
+      </w:r>
+    </w:p>
+    <w:p>
+      <w:pPr>
+        <w:pStyle w:val="ListBullet"/>
+      </w:pPr>
+      <w:r>
+        <w:t>Reads the raw file headers and exported catalog information so the project can document source fields.</w:t>
+      </w:r>
+    </w:p>
+    <w:p>
+      <w:pPr>
+        <w:pStyle w:val="ListBullet"/>
+      </w:pPr>
+      <w:r>
+        <w:t>Standardizes key fields used across files, including EINs, filing years, filing forms, state values, ZIP codes, and project geography fields.</w:t>
+      </w:r>
+    </w:p>
+    <w:p>
+      <w:pPr>
+        <w:pStyle w:val="ListBullet"/>
+      </w:pPr>
+      <w:r>
+        <w:t xml:space="preserve">Keeps records for tax years </w:t>
+      </w:r>
+      <w:r>
+        <w:rPr>
+          <w:rFonts w:ascii="Consolas" w:hAnsi="Consolas"/>
+          <w:sz w:val="20"/>
+        </w:rPr>
+        <w:t>2022-2024</w:t>
+      </w:r>
+      <w:r>
+        <w:t>.</w:t>
+      </w:r>
+    </w:p>
+    <w:p>
+      <w:pPr>
+        <w:pStyle w:val="ListBullet"/>
+      </w:pPr>
+      <w:r>
+        <w:t>Keeps records that can be matched to the project counties and regions before combining large files.</w:t>
+      </w:r>
+    </w:p>
+    <w:p>
+      <w:pPr>
+        <w:pStyle w:val="ListBullet"/>
+      </w:pPr>
+      <w:r>
+        <w:t>Builds project-region geography from ZIP and county reference files.</w:t>
+      </w:r>
+    </w:p>
+    <w:p>
+      <w:pPr>
+        <w:pStyle w:val="ListBullet"/>
+      </w:pPr>
+      <w:r>
+        <w:t>When multiple filing records could represent the same organization, year, and form, keeps one record using documented tie-break rules.</w:t>
+      </w:r>
+    </w:p>
+    <w:p>
+      <w:pPr>
+        <w:pStyle w:val="ListBullet"/>
+      </w:pPr>
+      <w:r>
+        <w:t>Combines Basic Fields and Combined Forms information only after the project-region and year filters have been applied.</w:t>
+      </w:r>
+    </w:p>
+    <w:p>
+      <w:pPr>
+        <w:pStyle w:val="ListBullet"/>
+      </w:pPr>
+      <w:r>
+        <w:t>Calculates analysis fields such as total revenue, total expenses, surplus, net margin, months of reserves, and selected contribution-related measures when the source fields support them.</w:t>
+      </w:r>
+    </w:p>
+    <w:p>
+      <w:pPr>
+        <w:pStyle w:val="ListBullet"/>
+      </w:pPr>
+      <w:r>
+        <w:t>Adds classification information, such as NTEE and subsection codes, from NCCS BMF and IRS EO BMF when GivingTuesday does not provide those fields directly.</w:t>
+      </w:r>
+    </w:p>
+    <w:p>
+      <w:pPr>
+        <w:pStyle w:val="ListBullet"/>
+      </w:pPr>
+      <w:r>
+        <w:t>Creates helper flags for hospitals, universities, and political organizations so analysts can include or exclude those groups consistently.</w:t>
+      </w:r>
+    </w:p>
+    <w:p>
+      <w:pPr>
+        <w:pStyle w:val="ListBullet"/>
+      </w:pPr>
+      <w:r>
+        <w:t>Leaves fields blank when the source does not support a reliable value, rather than filling them from a weaker source.</w:t>
       </w:r>
     </w:p>
     <w:p>
@@ -360,7 +528,7 @@
           <w:rFonts w:ascii="Consolas" w:hAnsi="Consolas"/>
           <w:sz w:val="20"/>
         </w:rPr>
-        <w:t>documentation/final_preprocessing_docs/technical_docs/analysis_variable_mappings/givingtuesday_basic_analysis_variable_mapping.md</w:t>
+        <w:t>docs/final_preprocessing_docs/technical_docs/analysis_variable_mappings/givingtuesday_basic_analysis_variable_mapping.md</w:t>
       </w:r>
       <w:r>
         <w:t xml:space="preserve"> as the analysis-ready data dictionary. Use </w:t>
@@ -370,10 +538,18 @@
           <w:rFonts w:ascii="Consolas" w:hAnsi="Consolas"/>
           <w:sz w:val="20"/>
         </w:rPr>
-        <w:t>documentation/final_preprocessing_docs/technical_docs/quality/coverage_evidence/givingtuesday_990_basic_allforms_analysis_variable_coverage.csv</w:t>
+        <w:t>docs/final_preprocessing_docs/technical_docs/quality/coverage_evidence/givingtuesday_990_basic_allforms_analysis_variable_coverage.csv</w:t>
       </w:r>
       <w:r>
         <w:t xml:space="preserve"> to confirm populated counts and coverage.</w:t>
+      </w:r>
+    </w:p>
+    <w:p>
+      <w:pPr>
+        <w:spacing w:before="0" w:after="80"/>
+      </w:pPr>
+      <w:r>
+        <w:t>For contribution and revenue-source analysis, the most important point is that the DataMart follows the structure of the IRS forms. Full Form 990 filers provide the most detailed contribution subcategories. Form 990-EZ and Form 990-PF filers provide less detail. Some categories, especially "other contributions" on Form 990, cannot be cleanly split into individual giving versus institutional giving without additional data that is not in this DataMart.</w:t>
       </w:r>
     </w:p>
     <w:p>
@@ -394,7 +570,7 @@
           <w:rFonts w:ascii="Consolas" w:hAnsi="Consolas"/>
           <w:sz w:val="20"/>
         </w:rPr>
-        <w:t>documentation/final_preprocessing_docs/technical_docs/source_dictionaries/givingtuesday_datamarts/datamart_catalog.md</w:t>
+        <w:t>docs/final_preprocessing_docs/technical_docs/source_dictionaries/givingtuesday_datamarts/datamart_catalog.md</w:t>
       </w:r>
       <w:r>
         <w:t>.</w:t>
@@ -410,7 +586,7 @@
           <w:rFonts w:ascii="Consolas" w:hAnsi="Consolas"/>
           <w:sz w:val="20"/>
         </w:rPr>
-        <w:t>documentation/final_preprocessing_docs/technical_docs/source_dictionaries/givingtuesday_datamarts/datamart_fields.md</w:t>
+        <w:t>docs/final_preprocessing_docs/technical_docs/source_dictionaries/givingtuesday_datamarts/datamart_fields.md</w:t>
       </w:r>
       <w:r>
         <w:t>.</w:t>
@@ -426,7 +602,7 @@
           <w:rFonts w:ascii="Consolas" w:hAnsi="Consolas"/>
           <w:sz w:val="20"/>
         </w:rPr>
-        <w:t>documentation/final_preprocessing_docs/technical_docs/source_dictionaries/givingtuesday_datamarts/datamart_catalog.csv</w:t>
+        <w:t>docs/final_preprocessing_docs/technical_docs/source_dictionaries/givingtuesday_datamarts/datamart_catalog.csv</w:t>
       </w:r>
       <w:r>
         <w:t>.</w:t>
@@ -442,7 +618,7 @@
           <w:rFonts w:ascii="Consolas" w:hAnsi="Consolas"/>
           <w:sz w:val="20"/>
         </w:rPr>
-        <w:t>documentation/final_preprocessing_docs/technical_docs/source_dictionaries/givingtuesday_datamarts/datamart_fields.csv</w:t>
+        <w:t>docs/final_preprocessing_docs/technical_docs/source_dictionaries/givingtuesday_datamarts/datamart_fields.csv</w:t>
       </w:r>
       <w:r>
         <w:t>.</w:t>

</xml_diff>

<commit_message>
Add analysis docs, update client docs, add scripts
Add extensive analysis documentation and presentation materials (Analysis Plan working draft, Section3 analysis and Q9 client presentation, multiple Section3 assets and final report drafts), plus analysis proposals and open-questions notes. Update client-facing preprocessing documentation (multiple markdown and Word docs under docs/final_preprocessing_docs). Modify revenue_sources_black_hills.py and add utility scripts for auditing and syncing final report sections (scripts/audit_final_report_docx.py, scripts/diagnostics/form_990_line1_blanks_audit.* and scripts/sync_final_report_black_sections.py). These changes introduce new content and tooling to support the Q9 revenue-source analysis and final report preparation.
</commit_message>
<xml_diff>
--- a/docs/final_preprocessing_docs/general_docs/word/givingtuesday_990_datamart_client_documentation.docx
+++ b/docs/final_preprocessing_docs/general_docs/word/givingtuesday_990_datamart_client_documentation.docx
@@ -40,24 +40,6 @@
       </w:pPr>
       <w:r>
         <w:t>This dataset is useful because it contains more detailed financial information than registry-style sources such as BMF. It is also important to interpret carefully: different organizations file different versions of the Form 990 family, and the IRS forms do not always separate donor types in the way analysts may want.</w:t>
-      </w:r>
-    </w:p>
-    <w:p>
-      <w:pPr>
-        <w:spacing w:before="0" w:after="80"/>
-      </w:pPr>
-      <w:r>
-        <w:t xml:space="preserve">The detailed technical pipeline documentation is </w:t>
-      </w:r>
-      <w:r>
-        <w:rPr>
-          <w:rFonts w:ascii="Consolas" w:hAnsi="Consolas"/>
-          <w:sz w:val="20"/>
-        </w:rPr>
-        <w:t>docs/final_preprocessing_docs/technical_docs/pipeline_docs/givingtuesday_datamart_pipeline.md</w:t>
-      </w:r>
-      <w:r>
-        <w:t>.</w:t>
       </w:r>
     </w:p>
     <w:p>
@@ -117,15 +99,67 @@
         <w:pStyle w:val="ListBullet"/>
       </w:pPr>
       <w:r>
-        <w:t>Per-file download URLs are selected from the GivingTuesday catalog and recorded in the pipeline manifests.</w:t>
+        <w:t>Source file names used for the project:</w:t>
       </w:r>
     </w:p>
     <w:p>
       <w:pPr>
-        <w:pStyle w:val="ListBullet"/>
+        <w:spacing w:before="0" w:after="80"/>
       </w:pPr>
       <w:r>
-        <w:t>Raw dictionary support comes from the exported GivingTuesday catalog and field dictionary files.</w:t>
+        <w:t xml:space="preserve">  - </w:t>
+      </w:r>
+      <w:r>
+        <w:rPr>
+          <w:rFonts w:ascii="Consolas" w:hAnsi="Consolas"/>
+          <w:sz w:val="20"/>
+        </w:rPr>
+        <w:t>2025_10_18_All_Years_990StandardFields.csv</w:t>
+      </w:r>
+    </w:p>
+    <w:p>
+      <w:pPr>
+        <w:spacing w:before="0" w:after="80"/>
+      </w:pPr>
+      <w:r>
+        <w:t xml:space="preserve">  - </w:t>
+      </w:r>
+      <w:r>
+        <w:rPr>
+          <w:rFonts w:ascii="Consolas" w:hAnsi="Consolas"/>
+          <w:sz w:val="20"/>
+        </w:rPr>
+        <w:t>2025_10_28_All_Years_990EZStandardFields.csv</w:t>
+      </w:r>
+    </w:p>
+    <w:p>
+      <w:pPr>
+        <w:spacing w:before="0" w:after="80"/>
+      </w:pPr>
+      <w:r>
+        <w:t xml:space="preserve">  - </w:t>
+      </w:r>
+      <w:r>
+        <w:rPr>
+          <w:rFonts w:ascii="Consolas" w:hAnsi="Consolas"/>
+          <w:sz w:val="20"/>
+        </w:rPr>
+        <w:t>2025_08_29_All_Years_990PFStandardFields.csv</w:t>
+      </w:r>
+    </w:p>
+    <w:p>
+      <w:pPr>
+        <w:spacing w:before="0" w:after="80"/>
+      </w:pPr>
+      <w:r>
+        <w:t xml:space="preserve">  - </w:t>
+      </w:r>
+      <w:r>
+        <w:rPr>
+          <w:rFonts w:ascii="Consolas" w:hAnsi="Consolas"/>
+          <w:sz w:val="20"/>
+        </w:rPr>
+        <w:t>2025_07_10_All_Years_990_990ez_990pf_990n_Combined_DataMart.csv</w:t>
       </w:r>
     </w:p>
     <w:p>
@@ -223,7 +257,7 @@
         <w:pStyle w:val="Heading2"/>
       </w:pPr>
       <w:r>
-        <w:t>Download And S3 Storage</w:t>
+        <w:t>Source Files Used</w:t>
       </w:r>
     </w:p>
     <w:p>
@@ -231,45 +265,7 @@
         <w:spacing w:before="0" w:after="80"/>
       </w:pPr>
       <w:r>
-        <w:t xml:space="preserve">Required raw GivingTuesday CSV files and metadata are downloaded locally, uploaded unchanged to Bronze S3 under </w:t>
-      </w:r>
-      <w:r>
-        <w:rPr>
-          <w:rFonts w:ascii="Consolas" w:hAnsi="Consolas"/>
-          <w:sz w:val="20"/>
-        </w:rPr>
-        <w:t>bronze/givingtuesday_990/datamarts/raw/</w:t>
-      </w:r>
-      <w:r>
-        <w:t xml:space="preserve"> and </w:t>
-      </w:r>
-      <w:r>
-        <w:rPr>
-          <w:rFonts w:ascii="Consolas" w:hAnsi="Consolas"/>
-          <w:sz w:val="20"/>
-        </w:rPr>
-        <w:t>bronze/givingtuesday_990/datamarts/metadata/</w:t>
-      </w:r>
-      <w:r>
-        <w:t>, and checked against expected file sizes. This gives the project a preserved copy of the downloaded source files.</w:t>
-      </w:r>
-    </w:p>
-    <w:p>
-      <w:pPr>
-        <w:spacing w:before="0" w:after="80"/>
-      </w:pPr>
-      <w:r>
-        <w:t xml:space="preserve">Intermediate project-ready outputs are stored under the GivingTuesday Bronze and Silver prefixes. Final analysis documentation and analysis outputs are stored under </w:t>
-      </w:r>
-      <w:r>
-        <w:rPr>
-          <w:rFonts w:ascii="Consolas" w:hAnsi="Consolas"/>
-          <w:sz w:val="20"/>
-        </w:rPr>
-        <w:t>silver/givingtuesday_990/analysis/</w:t>
-      </w:r>
-      <w:r>
-        <w:t>.</w:t>
+        <w:t>The project uses GivingTuesday's public DataMart catalog to identify and download the selected Basic Fields files for Forms 990, 990-EZ, and 990-PF. The Combined Forms DataMart is used upstream for record admission and filtering support. The final row-level analysis dataset is based on the selected Basic Fields files, with classification enrichment from registry sources when needed.</w:t>
       </w:r>
     </w:p>
     <w:p>
@@ -285,7 +281,7 @@
         <w:spacing w:before="0" w:after="80"/>
       </w:pPr>
       <w:r>
-        <w:t>The raw GivingTuesday CSV files are preserved unchanged in Bronze S3. Later pipeline steps convert the data into Parquet files, which are easier and faster to read in Python. These converted files include a normalized Combined Forms cache, pre-Silver files, Silver project-region files, and final analysis outputs.</w:t>
+        <w:t>The raw GivingTuesday CSV files are converted into smaller project-specific files after filtering to the project geography and tax-year scope. Intermediate working formats are used for processing efficiency, while the client deliverable uses CSV files.</w:t>
       </w:r>
     </w:p>
     <w:p>
@@ -415,97 +411,33 @@
         <w:pStyle w:val="Heading2"/>
       </w:pPr>
       <w:r>
-        <w:t>Analysis-Ready Outputs</w:t>
+        <w:t>Analysis-Ready CSV Deliverables</w:t>
       </w:r>
     </w:p>
     <w:p>
       <w:pPr>
         <w:pStyle w:val="ListBullet"/>
       </w:pPr>
-      <w:r>
-        <w:t xml:space="preserve">Row-level analysis dataset: </w:t>
-      </w:r>
+      <w:r/>
       <w:r>
         <w:rPr>
           <w:rFonts w:ascii="Consolas" w:hAnsi="Consolas"/>
           <w:sz w:val="20"/>
         </w:rPr>
-        <w:t>silver/givingtuesday_990/analysis/givingtuesday_990_basic_allforms_analysis_variables.parquet</w:t>
-      </w:r>
-      <w:r>
-        <w:t>.</w:t>
+        <w:t>givingtuesday_990_basic_allforms_analysis_variables.csv</w:t>
       </w:r>
     </w:p>
     <w:p>
       <w:pPr>
         <w:pStyle w:val="ListBullet"/>
       </w:pPr>
-      <w:r>
-        <w:t xml:space="preserve">Region metrics: </w:t>
-      </w:r>
+      <w:r/>
       <w:r>
         <w:rPr>
           <w:rFonts w:ascii="Consolas" w:hAnsi="Consolas"/>
           <w:sz w:val="20"/>
         </w:rPr>
-        <w:t>silver/givingtuesday_990/analysis/givingtuesday_990_basic_allforms_analysis_region_metrics.parquet</w:t>
-      </w:r>
-      <w:r>
-        <w:t>.</w:t>
-      </w:r>
-    </w:p>
-    <w:p>
-      <w:pPr>
-        <w:pStyle w:val="ListBullet"/>
-      </w:pPr>
-      <w:r>
-        <w:t xml:space="preserve">Pipeline documentation: </w:t>
-      </w:r>
-      <w:r>
-        <w:rPr>
-          <w:rFonts w:ascii="Consolas" w:hAnsi="Consolas"/>
-          <w:sz w:val="20"/>
-        </w:rPr>
-        <w:t>silver/givingtuesday_990/analysis/documentation/givingtuesday_datamart_pipeline.md</w:t>
-      </w:r>
-      <w:r>
-        <w:t>.</w:t>
-      </w:r>
-    </w:p>
-    <w:p>
-      <w:pPr>
-        <w:pStyle w:val="ListBullet"/>
-      </w:pPr>
-      <w:r>
-        <w:t xml:space="preserve">Variable mapping: </w:t>
-      </w:r>
-      <w:r>
-        <w:rPr>
-          <w:rFonts w:ascii="Consolas" w:hAnsi="Consolas"/>
-          <w:sz w:val="20"/>
-        </w:rPr>
-        <w:t>silver/givingtuesday_990/analysis/variable_mappings/givingtuesday_basic_analysis_variable_mapping.md</w:t>
-      </w:r>
-      <w:r>
-        <w:t>.</w:t>
-      </w:r>
-    </w:p>
-    <w:p>
-      <w:pPr>
-        <w:pStyle w:val="ListBullet"/>
-      </w:pPr>
-      <w:r>
-        <w:t xml:space="preserve">Coverage evidence: </w:t>
-      </w:r>
-      <w:r>
-        <w:rPr>
-          <w:rFonts w:ascii="Consolas" w:hAnsi="Consolas"/>
-          <w:sz w:val="20"/>
-        </w:rPr>
-        <w:t>silver/givingtuesday_990/analysis/quality/coverage/givingtuesday_990_basic_allforms_analysis_variable_coverage.csv</w:t>
-      </w:r>
-      <w:r>
-        <w:t>.</w:t>
+        <w:t>givingtuesday_990_basic_allforms_analysis_region_metrics.csv</w:t>
       </w:r>
     </w:p>
     <w:p>
@@ -521,27 +453,7 @@
         <w:spacing w:before="0" w:after="80"/>
       </w:pPr>
       <w:r>
-        <w:t xml:space="preserve">Use </w:t>
-      </w:r>
-      <w:r>
-        <w:rPr>
-          <w:rFonts w:ascii="Consolas" w:hAnsi="Consolas"/>
-          <w:sz w:val="20"/>
-        </w:rPr>
-        <w:t>docs/final_preprocessing_docs/technical_docs/analysis_variable_mappings/givingtuesday_basic_analysis_variable_mapping.md</w:t>
-      </w:r>
-      <w:r>
-        <w:t xml:space="preserve"> as the analysis-ready data dictionary. Use </w:t>
-      </w:r>
-      <w:r>
-        <w:rPr>
-          <w:rFonts w:ascii="Consolas" w:hAnsi="Consolas"/>
-          <w:sz w:val="20"/>
-        </w:rPr>
-        <w:t>docs/final_preprocessing_docs/technical_docs/quality/coverage_evidence/givingtuesday_990_basic_allforms_analysis_variable_coverage.csv</w:t>
-      </w:r>
-      <w:r>
-        <w:t xml:space="preserve"> to confirm populated counts and coverage.</w:t>
+        <w:t>The deliverable package includes a separate data dictionary for the analysis-ready CSV files.</w:t>
       </w:r>
     </w:p>
     <w:p>
@@ -550,78 +462,6 @@
       </w:pPr>
       <w:r>
         <w:t>For contribution and revenue-source analysis, the most important point is that the DataMart follows the structure of the IRS forms. Full Form 990 filers provide the most detailed contribution subcategories. Form 990-EZ and Form 990-PF filers provide less detail. Some categories, especially "other contributions" on Form 990, cannot be cleanly split into individual giving versus institutional giving without additional data that is not in this DataMart.</w:t>
-      </w:r>
-    </w:p>
-    <w:p>
-      <w:pPr>
-        <w:pStyle w:val="Heading2"/>
-      </w:pPr>
-      <w:r>
-        <w:t>Supporting Raw Dictionaries</w:t>
-      </w:r>
-    </w:p>
-    <w:p>
-      <w:pPr>
-        <w:pStyle w:val="ListBullet"/>
-      </w:pPr>
-      <w:r/>
-      <w:r>
-        <w:rPr>
-          <w:rFonts w:ascii="Consolas" w:hAnsi="Consolas"/>
-          <w:sz w:val="20"/>
-        </w:rPr>
-        <w:t>docs/final_preprocessing_docs/technical_docs/source_dictionaries/givingtuesday_datamarts/datamart_catalog.md</w:t>
-      </w:r>
-      <w:r>
-        <w:t>.</w:t>
-      </w:r>
-    </w:p>
-    <w:p>
-      <w:pPr>
-        <w:pStyle w:val="ListBullet"/>
-      </w:pPr>
-      <w:r/>
-      <w:r>
-        <w:rPr>
-          <w:rFonts w:ascii="Consolas" w:hAnsi="Consolas"/>
-          <w:sz w:val="20"/>
-        </w:rPr>
-        <w:t>docs/final_preprocessing_docs/technical_docs/source_dictionaries/givingtuesday_datamarts/datamart_fields.md</w:t>
-      </w:r>
-      <w:r>
-        <w:t>.</w:t>
-      </w:r>
-    </w:p>
-    <w:p>
-      <w:pPr>
-        <w:pStyle w:val="ListBullet"/>
-      </w:pPr>
-      <w:r/>
-      <w:r>
-        <w:rPr>
-          <w:rFonts w:ascii="Consolas" w:hAnsi="Consolas"/>
-          <w:sz w:val="20"/>
-        </w:rPr>
-        <w:t>docs/final_preprocessing_docs/technical_docs/source_dictionaries/givingtuesday_datamarts/datamart_catalog.csv</w:t>
-      </w:r>
-      <w:r>
-        <w:t>.</w:t>
-      </w:r>
-    </w:p>
-    <w:p>
-      <w:pPr>
-        <w:pStyle w:val="ListBullet"/>
-      </w:pPr>
-      <w:r/>
-      <w:r>
-        <w:rPr>
-          <w:rFonts w:ascii="Consolas" w:hAnsi="Consolas"/>
-          <w:sz w:val="20"/>
-        </w:rPr>
-        <w:t>docs/final_preprocessing_docs/technical_docs/source_dictionaries/givingtuesday_datamarts/datamart_fields.csv</w:t>
-      </w:r>
-      <w:r>
-        <w:t>.</w:t>
       </w:r>
     </w:p>
     <w:sectPr>

</xml_diff>